<commit_message>
Ajout des fichier pour le projet_2 contexte
</commit_message>
<xml_diff>
--- a/anglais/semaine_8/Reading_Research.docx
+++ b/anglais/semaine_8/Reading_Research.docx
@@ -11,9 +11,6 @@
         <w:rPr/>
         <w:t>Christopher-William Archambault-Bouffard</w:t>
         <w:tab/>
-      </w:r>
-      <w:r>
-        <w:rPr/>
         <w:t>Gr : 02</w:t>
       </w:r>
     </w:p>
@@ -34,19 +31,11 @@
       </w:pPr>
       <w:r>
         <w:rPr/>
-        <w:t xml:space="preserve">2. </w:t>
+        <w:t xml:space="preserve">2. Number of words : 1224, </w:t>
       </w:r>
       <w:r>
         <w:rPr/>
-        <w:t>Number of words</w:t>
-      </w:r>
-      <w:r>
-        <w:rPr/>
-        <w:t xml:space="preserve"> : </w:t>
-      </w:r>
-      <w:r>
-        <w:rPr/>
-        <w:t>1224</w:t>
+        <w:t>stop at Fewer collisions, faster results for 763 words</w:t>
       </w:r>
     </w:p>
     <w:p>
@@ -56,15 +45,7 @@
       </w:pPr>
       <w:r>
         <w:rPr/>
-        <w:t xml:space="preserve">3. </w:t>
-      </w:r>
-      <w:r>
-        <w:rPr/>
-        <w:t>Reference to the source</w:t>
-      </w:r>
-      <w:r>
-        <w:rPr/>
-        <w:t xml:space="preserve"> : https://news.mit.edu/2023/new-method-hash-function-online-databases-0313</w:t>
+        <w:t>3. Reference to the source : https://news.mit.edu/2023/new-method-hash-function-online-databases-0313</w:t>
       </w:r>
     </w:p>
     <w:p>
@@ -74,11 +55,7 @@
       </w:pPr>
       <w:r>
         <w:rPr/>
-        <w:t xml:space="preserve">4. Justification of the reliabe source : </w:t>
-      </w:r>
-      <w:r>
-        <w:rPr/>
-        <w:t>MIT is a reliable source because it’s an institut for research and a univerity. This institut is specialize in technology and it is consider one of the best american university by Forbes.</w:t>
+        <w:t>4. Justification of the reliabe source : MIT is a reliable source because it’s an institut for research and a univerity. This institut is specialize in technology and it is consider one of the best american university by Forbes.</w:t>
       </w:r>
     </w:p>
     <w:p>
@@ -88,11 +65,7 @@
       </w:pPr>
       <w:r>
         <w:rPr/>
-        <w:t xml:space="preserve">5. </w:t>
-      </w:r>
-      <w:r>
-        <w:rPr/>
-        <w:t>Level-appropriate, field-related vocabulary and definitions</w:t>
+        <w:t>5. Level-appropriate, field-related vocabulary and definitions</w:t>
       </w:r>
     </w:p>
     <w:p>
@@ -104,15 +77,13 @@
         <w:rPr/>
         <w:t xml:space="preserve">(1) </w:t>
       </w:r>
-    </w:p>
-    <w:p>
-      <w:pPr>
-        <w:pStyle w:val="Normal"/>
-        <w:rPr/>
-      </w:pPr>
       <w:r>
         <w:rPr/>
-        <w:t xml:space="preserve">(2) </w:t>
+        <w:t xml:space="preserve">Cryptography </w:t>
+      </w:r>
+      <w:r>
+        <w:rPr/>
+        <w:t>Word frequency : 2</w:t>
       </w:r>
     </w:p>
     <w:p>
@@ -122,7 +93,11 @@
       </w:pPr>
       <w:r>
         <w:rPr/>
-        <w:t xml:space="preserve">(3) </w:t>
+        <w:t xml:space="preserve">(2) </w:t>
+      </w:r>
+      <w:r>
+        <w:rPr/>
+        <w:t>Hashing</w:t>
       </w:r>
     </w:p>
     <w:p>
@@ -132,11 +107,21 @@
       </w:pPr>
       <w:r>
         <w:rPr/>
-        <w:t xml:space="preserve">6.  </w:t>
+        <w:t xml:space="preserve">(3) </w:t>
       </w:r>
       <w:r>
         <w:rPr/>
-        <w:t>Main ideas :</w:t>
+        <w:t>Algorithm</w:t>
+      </w:r>
+    </w:p>
+    <w:p>
+      <w:pPr>
+        <w:pStyle w:val="Normal"/>
+        <w:rPr/>
+      </w:pPr>
+      <w:r>
+        <w:rPr/>
+        <w:t>6.  Main ideas :</w:t>
       </w:r>
     </w:p>
     <w:p>
@@ -557,6 +542,7 @@
     <w:qFormat/>
     <w:pPr>
       <w:widowControl/>
+      <w:suppressAutoHyphens w:val="true"/>
       <w:bidi w:val="0"/>
       <w:spacing w:lineRule="auto" w:line="259" w:before="0" w:after="160"/>
       <w:jc w:val="left"/>
@@ -656,6 +642,7 @@
     <w:qFormat/>
     <w:pPr>
       <w:widowControl/>
+      <w:suppressAutoHyphens w:val="true"/>
       <w:bidi w:val="0"/>
       <w:spacing w:lineRule="atLeast" w:line="200" w:before="0" w:after="0"/>
       <w:jc w:val="left"/>
@@ -813,6 +800,7 @@
     <w:qFormat/>
     <w:pPr>
       <w:widowControl/>
+      <w:suppressAutoHyphens w:val="true"/>
       <w:bidi w:val="0"/>
       <w:spacing w:lineRule="auto" w:line="259" w:before="0" w:after="160"/>
       <w:jc w:val="left"/>
@@ -990,6 +978,7 @@
     <w:qFormat/>
     <w:pPr>
       <w:widowControl/>
+      <w:suppressAutoHyphens w:val="true"/>
       <w:bidi w:val="0"/>
       <w:spacing w:lineRule="atLeast" w:line="200" w:before="283" w:after="0"/>
       <w:jc w:val="left"/>
@@ -1217,6 +1206,7 @@
     <w:qFormat/>
     <w:pPr>
       <w:widowControl/>
+      <w:suppressAutoHyphens w:val="true"/>
       <w:bidi w:val="0"/>
       <w:spacing w:lineRule="atLeast" w:line="200" w:before="0" w:after="160"/>
       <w:jc w:val="left"/>
@@ -1244,6 +1234,7 @@
     <w:qFormat/>
     <w:pPr>
       <w:widowControl/>
+      <w:suppressAutoHyphens w:val="true"/>
       <w:bidi w:val="0"/>
       <w:spacing w:lineRule="auto" w:line="259" w:before="0" w:after="160"/>
       <w:jc w:val="center"/>
@@ -1270,6 +1261,7 @@
     <w:qFormat/>
     <w:pPr>
       <w:widowControl/>
+      <w:suppressAutoHyphens w:val="true"/>
       <w:bidi w:val="0"/>
       <w:spacing w:lineRule="auto" w:line="259" w:before="0" w:after="160"/>
       <w:ind w:left="340" w:hanging="340"/>
@@ -1297,6 +1289,7 @@
     <w:qFormat/>
     <w:pPr>
       <w:widowControl/>
+      <w:suppressAutoHyphens w:val="true"/>
       <w:bidi w:val="0"/>
       <w:spacing w:lineRule="auto" w:line="259" w:before="0" w:after="160"/>
       <w:jc w:val="left"/>
@@ -1315,6 +1308,7 @@
     <w:qFormat/>
     <w:pPr>
       <w:widowControl/>
+      <w:suppressAutoHyphens w:val="true"/>
       <w:bidi w:val="0"/>
       <w:spacing w:lineRule="auto" w:line="259" w:before="0" w:after="160"/>
       <w:jc w:val="left"/>
@@ -1333,6 +1327,7 @@
     <w:qFormat/>
     <w:pPr>
       <w:widowControl/>
+      <w:suppressAutoHyphens w:val="true"/>
       <w:bidi w:val="0"/>
       <w:spacing w:lineRule="atLeast" w:line="200" w:before="0" w:after="0"/>
       <w:jc w:val="left"/>
@@ -1813,6 +1808,7 @@
     <w:qFormat/>
     <w:pPr>
       <w:widowControl/>
+      <w:suppressAutoHyphens w:val="true"/>
       <w:bidi w:val="0"/>
       <w:spacing w:lineRule="auto" w:line="259" w:before="0" w:after="160"/>
       <w:jc w:val="left"/>
@@ -1831,6 +1827,7 @@
     <w:qFormat/>
     <w:pPr>
       <w:widowControl/>
+      <w:suppressAutoHyphens w:val="true"/>
       <w:bidi w:val="0"/>
       <w:spacing w:lineRule="auto" w:line="259" w:before="0" w:after="160"/>
       <w:jc w:val="left"/>
@@ -1849,6 +1846,7 @@
     <w:qFormat/>
     <w:pPr>
       <w:widowControl/>
+      <w:suppressAutoHyphens w:val="true"/>
       <w:bidi w:val="0"/>
       <w:spacing w:lineRule="auto" w:line="259" w:before="0" w:after="160"/>
       <w:ind w:left="340" w:hanging="340"/>
@@ -1876,6 +1874,7 @@
     <w:qFormat/>
     <w:pPr>
       <w:widowControl/>
+      <w:suppressAutoHyphens w:val="true"/>
       <w:bidi w:val="0"/>
       <w:spacing w:lineRule="atLeast" w:line="200" w:before="283" w:after="0"/>
       <w:jc w:val="left"/>

</xml_diff>